<commit_message>
feat: strengthen recruiter positioning and resume alignment
</commit_message>
<xml_diff>
--- a/assets/resume/jeremy-fontenot-resume.docx
+++ b/assets/resume/jeremy-fontenot-resume.docx
@@ -14,7 +14,7 @@
           <w:rFonts w:ascii="Arial" w:hAnsi="Arial" w:eastAsia="Arial"/>
           <w:b/>
           <w:color w:val="111827"/>
-          <w:sz w:val="32"/>
+          <w:sz w:val="30"/>
         </w:rPr>
         <w:t>JEREMY FONTENOT</w:t>
       </w:r>
@@ -27,7 +27,7 @@
         <w:rPr>
           <w:rFonts w:ascii="Arial" w:hAnsi="Arial" w:eastAsia="Arial"/>
           <w:color w:val="4B5563"/>
-          <w:sz w:val="17"/>
+          <w:sz w:val="16"/>
         </w:rPr>
         <w:t>Abbeville, LA | 337-398-9327 | jeremy.fontenot@jeremyfontenot.online</w:t>
         <w:br/>
@@ -44,7 +44,7 @@
     </w:p>
     <w:p>
       <w:r>
-        <w:t>Experienced Service Desk Technician and IT Support Professional with enterprise support experience across retail, healthcare, and managed service environments. Proven ability to troubleshoot Windows, macOS, Microsoft 365, identity access, SaaS, endpoint, and network connectivity issues while maintaining SLA discipline and clear documentation. Actively building and validating Systems Administration and Infrastructure Operations capabilities through hands-on lab work, automation, infrastructure documentation, and evidence-backed project records.</w:t>
+        <w:t>Experienced Service Desk Technician and IT Support Professional with enterprise support experience across managed service provider (MSP), healthcare, and retail environments. Proven record supporting Windows, macOS, Microsoft 365, identity access, SaaS, endpoint, and network-connectivity issues while maintaining SLA discipline, clear escalation notes, and customer-focused communication. Building Systems Administration and Infrastructure Operations capability through documented labs, PowerShell automation, Microsoft 365 and Entra ID validation records, infrastructure runbooks, and proof-linked project artifacts.</w:t>
       </w:r>
     </w:p>
     <w:p>
@@ -56,9 +56,6 @@
       </w:r>
     </w:p>
     <w:p>
-      <w:pPr>
-        <w:spacing w:after="30"/>
-      </w:pPr>
       <w:r>
         <w:rPr>
           <w:b/>
@@ -66,27 +63,21 @@
         <w:t xml:space="preserve">Service Desk &amp; ITSM: </w:t>
       </w:r>
       <w:r>
-        <w:t>Ticket triage, SLA support, ServiceNow, Ivanti, incident management, escalation, customer support, knowledge base documentation</w:t>
+        <w:t>Incident management, escalation management, ticket triage, ServiceNow, Ivanti, SLA compliance, knowledge management</w:t>
       </w:r>
     </w:p>
     <w:p>
-      <w:pPr>
-        <w:spacing w:after="30"/>
-      </w:pPr>
       <w:r>
         <w:rPr>
           <w:b/>
         </w:rPr>
-        <w:t xml:space="preserve">Microsoft &amp; Identity: </w:t>
+        <w:t xml:space="preserve">Microsoft 365 &amp; Identity: </w:t>
       </w:r>
       <w:r>
-        <w:t>Microsoft 365, Entra ID, Active Directory, Group Policy fundamentals, MFA, IAM workflows, account provisioning</w:t>
+        <w:t>Microsoft 365, Entra ID exposure, Active Directory fundamentals, MFA support, Conditional Access concepts, account provisioning</w:t>
       </w:r>
     </w:p>
     <w:p>
-      <w:pPr>
-        <w:spacing w:after="30"/>
-      </w:pPr>
       <w:r>
         <w:rPr>
           <w:b/>
@@ -94,27 +85,21 @@
         <w:t xml:space="preserve">Endpoint &amp; Operating Systems: </w:t>
       </w:r>
       <w:r>
-        <w:t>Windows 10/11, Windows Server 2016/2019/2022, macOS, Linux, system imaging, hardware/software support</w:t>
+        <w:t>Windows 10/11, Windows Server fundamentals, macOS, Linux, endpoint troubleshooting, system imaging, hardware/software support</w:t>
       </w:r>
     </w:p>
     <w:p>
-      <w:pPr>
-        <w:spacing w:after="30"/>
-      </w:pPr>
       <w:r>
         <w:rPr>
           <w:b/>
         </w:rPr>
-        <w:t xml:space="preserve">Networking &amp; Infrastructure: </w:t>
+        <w:t xml:space="preserve">Infrastructure &amp; Networking: </w:t>
       </w:r>
       <w:r>
-        <w:t>TCP/IP, DNS, DHCP, VPN troubleshooting, VLAN fundamentals, firewall fundamentals, virtualization, backup/recovery validation</w:t>
+        <w:t>DNS, DHCP, TCP/IP, VPN troubleshooting, VLAN fundamentals, firewall concepts, virtualization, backup and recovery validation</w:t>
       </w:r>
     </w:p>
     <w:p>
-      <w:pPr>
-        <w:spacing w:after="30"/>
-      </w:pPr>
       <w:r>
         <w:rPr>
           <w:b/>
@@ -122,7 +107,7 @@
         <w:t xml:space="preserve">Automation &amp; Documentation: </w:t>
       </w:r>
       <w:r>
-        <w:t>PowerShell scripting, Git, runbooks, change notes, validation checklists, root cause documentation, operational handoff</w:t>
+        <w:t>PowerShell, Git, runbooks, change management, validation checklists, RCA notes, operational handoff documentation</w:t>
       </w:r>
     </w:p>
     <w:p>
@@ -140,7 +125,7 @@
       <w:r>
         <w:rPr>
           <w:b/>
-          <w:sz w:val="18"/>
+          <w:sz w:val="17"/>
         </w:rPr>
         <w:t>Logicalis - Service Desk Technician (Vuori)</w:t>
       </w:r>
@@ -153,7 +138,7 @@
         <w:pStyle w:val="ListBullet"/>
       </w:pPr>
       <w:r>
-        <w:t>Serve as a primary technical support resource for Vuori Global Service Desk users across Windows, macOS, Microsoft 365, SaaS, and cloud-supported environments.</w:t>
+        <w:t>Provide enterprise service desk support for Vuori users across Windows, macOS, Microsoft 365, SaaS, endpoint, and cloud-supported workflows while maintaining SLA-focused ticket ownership.</w:t>
       </w:r>
     </w:p>
     <w:p>
@@ -161,7 +146,7 @@
         <w:pStyle w:val="ListBullet"/>
       </w:pPr>
       <w:r>
-        <w:t>Troubleshoot endpoint, operating system, application, account access, and connectivity issues while maintaining SLA-focused ticket handling and clear user communication.</w:t>
+        <w:t>Resolve and escalate hardware, operating system, account access, application, and connectivity incidents with clear user communication, impact notes, and documented troubleshooting steps.</w:t>
       </w:r>
     </w:p>
     <w:p>
@@ -169,7 +154,7 @@
         <w:pStyle w:val="ListBullet"/>
       </w:pPr>
       <w:r>
-        <w:t>Process Microsoft 365 and Entra ID identity requests including user provisioning, permissions, MFA-related support, and access workflow documentation.</w:t>
+        <w:t>Support Microsoft 365 and Entra ID related requests including account provisioning, permissions review, MFA support, and identity-access workflow documentation.</w:t>
       </w:r>
     </w:p>
     <w:p>
@@ -177,15 +162,7 @@
         <w:pStyle w:val="ListBullet"/>
       </w:pPr>
       <w:r>
-        <w:t>Document incidents, service requests, known fixes, and escalation notes to strengthen repeatability and reduce avoidable rework.</w:t>
-      </w:r>
-    </w:p>
-    <w:p>
-      <w:pPr>
-        <w:pStyle w:val="ListBullet"/>
-      </w:pPr>
-      <w:r>
-        <w:t>Collaborate with Tier 2, Tier 3, engineering, and business stakeholders to resolve issues requiring deeper infrastructure or application support.</w:t>
+        <w:t>Strengthen knowledge management by recording repeatable fixes, escalation context, service request details, and support handoff notes for higher-tier resolver teams.</w:t>
       </w:r>
     </w:p>
     <w:p>
@@ -195,7 +172,7 @@
       <w:r>
         <w:rPr>
           <w:b/>
-          <w:sz w:val="18"/>
+          <w:sz w:val="17"/>
         </w:rPr>
         <w:t>Insight Global - Service Desk Representative / Team Lead</w:t>
       </w:r>
@@ -208,7 +185,7 @@
         <w:pStyle w:val="ListBullet"/>
       </w:pPr>
       <w:r>
-        <w:t>Led daily service desk activity across enterprise support queues, including triage, escalation routing, and technician coordination.</w:t>
+        <w:t>Led daily service desk activity across enterprise support queues, coordinating triage, escalation routing, technician workflow, and customer-service expectations.</w:t>
       </w:r>
     </w:p>
     <w:p>
@@ -216,7 +193,7 @@
         <w:pStyle w:val="ListBullet"/>
       </w:pPr>
       <w:r>
-        <w:t>Supported end users across multiple technical platforms while preserving SLA discipline, accurate ticket updates, and customer service quality.</w:t>
+        <w:t>Improved ticket handling consistency by reinforcing SLA discipline, documentation quality, queue awareness, and repeatable troubleshooting procedures.</w:t>
       </w:r>
     </w:p>
     <w:p>
@@ -224,15 +201,7 @@
         <w:pStyle w:val="ListBullet"/>
       </w:pPr>
       <w:r>
-        <w:t>Served as an escalation point for advanced incidents and helped improve resolution consistency through workflow refinement and team coaching.</w:t>
-      </w:r>
-    </w:p>
-    <w:p>
-      <w:pPr>
-        <w:pStyle w:val="ListBullet"/>
-      </w:pPr>
-      <w:r>
-        <w:t>Trained and onboarded technicians on troubleshooting procedures, documentation expectations, and service delivery standards.</w:t>
+        <w:t>Served as an escalation point for complex support incidents and coached technicians on support standards, ticket documentation, and service delivery procedures.</w:t>
       </w:r>
     </w:p>
     <w:p>
@@ -242,7 +211,7 @@
       <w:r>
         <w:rPr>
           <w:b/>
-          <w:sz w:val="18"/>
+          <w:sz w:val="17"/>
         </w:rPr>
         <w:t>Completeful Technologies LLC - IT Technician</w:t>
       </w:r>
@@ -255,7 +224,7 @@
         <w:pStyle w:val="ListBullet"/>
       </w:pPr>
       <w:r>
-        <w:t>Configured and supported Windows and Linux systems, endpoint hardware, software, and routine operational maintenance tasks.</w:t>
+        <w:t>Supported Windows and Linux endpoints, hardware, software, and routine maintenance tasks in a hands-on technical support environment.</w:t>
       </w:r>
     </w:p>
     <w:p>
@@ -263,15 +232,7 @@
         <w:pStyle w:val="ListBullet"/>
       </w:pPr>
       <w:r>
-        <w:t>Assisted with Active Directory administration, endpoint management, and infrastructure support activities under operational guidance.</w:t>
-      </w:r>
-    </w:p>
-    <w:p>
-      <w:pPr>
-        <w:pStyle w:val="ListBullet"/>
-      </w:pPr>
-      <w:r>
-        <w:t>Troubleshot hardware, software, and network-related issues while documenting findings and support actions.</w:t>
+        <w:t>Assisted with Active Directory administration, endpoint management, device troubleshooting, and operational support activities under appropriate guidance.</w:t>
       </w:r>
     </w:p>
     <w:p>
@@ -287,7 +248,7 @@
         <w:pStyle w:val="ListBullet"/>
       </w:pPr>
       <w:r>
-        <w:t>Microsoft 365 and Entra ID lab records covering identity boundaries, Conditional Access intent, endpoint policy planning, and tenant-safe documentation.</w:t>
+        <w:t>Microsoft 365 and Entra ID lab records document identity boundaries, Conditional Access intent, endpoint policy planning, and tenant-safe administration workflows.</w:t>
       </w:r>
     </w:p>
     <w:p>
@@ -295,7 +256,7 @@
         <w:pStyle w:val="ListBullet"/>
       </w:pPr>
       <w:r>
-        <w:t>Active Directory and Windows Server lab documentation covering users, groups, DNS/DHCP concepts, Group Policy fundamentals, virtualization, and administrative workflows.</w:t>
+        <w:t>Active Directory and Windows Server lab documentation covers users, groups, OU planning, DNS/DHCP concepts, Group Policy fundamentals, and virtualization review paths.</w:t>
       </w:r>
     </w:p>
     <w:p>
@@ -303,15 +264,7 @@
         <w:pStyle w:val="ListBullet"/>
       </w:pPr>
       <w:r>
-        <w:t>Infrastructure operations artifacts covering runbooks, monitoring and validation thinking, backup/recovery review, change notes, and operational readiness checks.</w:t>
-      </w:r>
-    </w:p>
-    <w:p>
-      <w:pPr>
-        <w:pStyle w:val="ListBullet"/>
-      </w:pPr>
-      <w:r>
-        <w:t>PowerShell automation examples focused on readable scripts, dry-run review, validation output, and maintainable handoff documentation.</w:t>
+        <w:t>Infrastructure operations artifacts cover runbooks, monitoring concepts, backup/recovery validation, change notes, operational readiness, and escalation-aware handoff.</w:t>
       </w:r>
     </w:p>
     <w:p>
@@ -348,7 +301,7 @@
     </w:p>
     <w:p>
       <w:r>
-        <w:t>CompTIA A+ | CompTIA Server+ | CompTIA IT Fundamentals (ITF+) | Microsoft Azure Fundamentals (AZ-900) | MTA Networking Fundamentals | MTA Security Fundamentals | MTA Windows Server Administration Fundamentals | Linux Essentials | Google IT Support Professional Certificate</w:t>
+        <w:t>CompTIA A+ | CompTIA Server+ | CompTIA ITF+ | Microsoft Azure Fundamentals (AZ-900) | MTA Networking Fundamentals | MTA Security Fundamentals | MTA Windows Server Administration Fundamentals | Linux Essentials | Google IT Support Professional Certificate</w:t>
       </w:r>
     </w:p>
     <w:p>
@@ -366,7 +319,7 @@
     </w:p>
     <w:sectPr>
       <w:pgSz w:w="12240" w:h="15840"/>
-      <w:pgMar w:top="792" w:right="864" w:bottom="792" w:left="864" w:header="720" w:footer="720" w:gutter="0"/>
+      <w:pgMar w:top="648" w:right="792" w:bottom="648" w:left="792" w:header="720" w:footer="720" w:gutter="0"/>
       <w:cols w:space="720"/>
       <w:docGrid w:linePitch="360"/>
     </w:sectPr>
@@ -738,11 +691,11 @@
     <w:qFormat/>
     <w:rsid w:val="00FC693F"/>
     <w:pPr>
-      <w:spacing w:after="50" w:line="250" w:lineRule="auto"/>
+      <w:spacing w:after="34" w:line="240" w:lineRule="auto"/>
     </w:pPr>
     <w:rPr>
       <w:rFonts w:ascii="Arial" w:hAnsi="Arial" w:eastAsia="Arial"/>
-      <w:sz w:val="18"/>
+      <w:sz w:val="17"/>
     </w:rPr>
   </w:style>
   <w:style w:type="paragraph" w:styleId="Header">
@@ -800,7 +753,7 @@
     <w:pPr>
       <w:keepNext/>
       <w:keepLines/>
-      <w:spacing w:before="100" w:after="40"/>
+      <w:spacing w:before="72" w:after="28"/>
       <w:outlineLvl w:val="0"/>
     </w:pPr>
     <w:rPr>
@@ -808,7 +761,7 @@
       <w:b/>
       <w:bCs/>
       <w:color w:val="0BA8D8"/>
-      <w:sz w:val="22"/>
+      <w:sz w:val="20"/>
       <w:szCs w:val="28"/>
     </w:rPr>
   </w:style>
@@ -824,7 +777,7 @@
     <w:pPr>
       <w:keepNext/>
       <w:keepLines/>
-      <w:spacing w:before="80" w:after="40"/>
+      <w:spacing w:before="200" w:after="0"/>
       <w:outlineLvl w:val="1"/>
     </w:pPr>
     <w:rPr>
@@ -832,7 +785,7 @@
       <w:b/>
       <w:bCs/>
       <w:color w:val="0BA8D8"/>
-      <w:sz w:val="20"/>
+      <w:sz w:val="26"/>
       <w:szCs w:val="26"/>
     </w:rPr>
   </w:style>
@@ -1271,13 +1224,13 @@
       <w:numPr>
         <w:numId w:val="1"/>
       </w:numPr>
-      <w:spacing w:after="24" w:line="245" w:lineRule="auto"/>
-      <w:ind w:left="259" w:hanging="259"/>
+      <w:spacing w:after="12" w:line="230" w:lineRule="auto"/>
+      <w:ind w:left="230" w:hanging="230"/>
       <w:contextualSpacing/>
     </w:pPr>
     <w:rPr>
       <w:rFonts w:ascii="Arial" w:hAnsi="Arial"/>
-      <w:sz w:val="18"/>
+      <w:sz w:val="16"/>
     </w:rPr>
   </w:style>
   <w:style w:type="paragraph" w:styleId="ListBullet2">

</xml_diff>